<commit_message>
add: implementacion de nuevas tablas a la hora de generar el documento word respectivo al informe de oracle database
</commit_message>
<xml_diff>
--- a/plantillas_word/plantilla_informe.docx
+++ b/plantillas_word/plantilla_informe.docx
@@ -9,7 +9,7 @@
       <w:headerReference w:type="first" r:id="rId13"/>
       <w:footerReference w:type="first" r:id="rId14"/>
       <w:pgSz w:w="12240" w:h="15840"/>
-      <w:pgMar w:top="1417" w:right="1701" w:bottom="1417" w:left="1701" w:header="708" w:footer="708" w:gutter="0"/>
+      <w:pgMar w:top="1440" w:right="1440" w:bottom="1440" w:left="1440" w:header="709" w:footer="680" w:gutter="0"/>
       <w:cols w:space="708"/>
       <w:titlePg/>
       <w:docGrid w:linePitch="360"/>
@@ -50,15 +50,77 @@
         <w:lang w:eastAsia="es-CO"/>
       </w:rPr>
       <w:drawing>
-        <wp:anchor distT="0" distB="0" distL="114300" distR="114300" simplePos="0" relativeHeight="251672576" behindDoc="1" locked="0" layoutInCell="1" allowOverlap="1" wp14:anchorId="4865D704" wp14:editId="05F69CAF">
+        <wp:anchor distT="0" distB="0" distL="114300" distR="114300" simplePos="0" relativeHeight="251669504" behindDoc="0" locked="0" layoutInCell="1" allowOverlap="1" wp14:anchorId="37E6FDFB" wp14:editId="2B9D33AA">
+          <wp:simplePos x="0" y="0"/>
+          <wp:positionH relativeFrom="page">
+            <wp:align>left</wp:align>
+          </wp:positionH>
+          <wp:positionV relativeFrom="paragraph">
+            <wp:posOffset>-289560</wp:posOffset>
+          </wp:positionV>
+          <wp:extent cx="5410200" cy="902970"/>
+          <wp:effectExtent l="0" t="0" r="0" b="0"/>
+          <wp:wrapNone/>
+          <wp:docPr id="4118" name="2 Imagen" descr="net_GROUP_pie.png"/>
+          <wp:cNvGraphicFramePr>
+            <a:graphicFrameLocks xmlns:a="http://schemas.openxmlformats.org/drawingml/2006/main" noChangeAspect="1"/>
+          </wp:cNvGraphicFramePr>
+          <a:graphic xmlns:a="http://schemas.openxmlformats.org/drawingml/2006/main">
+            <a:graphicData uri="http://schemas.openxmlformats.org/drawingml/2006/picture">
+              <pic:pic xmlns:pic="http://schemas.openxmlformats.org/drawingml/2006/picture">
+                <pic:nvPicPr>
+                  <pic:cNvPr id="0" name="net_GROUP_pie.png"/>
+                  <pic:cNvPicPr/>
+                </pic:nvPicPr>
+                <pic:blipFill rotWithShape="1">
+                  <a:blip r:embed="rId1"/>
+                  <a:srcRect r="27561"/>
+                  <a:stretch/>
+                </pic:blipFill>
+                <pic:spPr bwMode="auto">
+                  <a:xfrm>
+                    <a:off x="0" y="0"/>
+                    <a:ext cx="5410200" cy="902970"/>
+                  </a:xfrm>
+                  <a:prstGeom prst="rect">
+                    <a:avLst/>
+                  </a:prstGeom>
+                  <a:ln>
+                    <a:noFill/>
+                  </a:ln>
+                  <a:extLst>
+                    <a:ext uri="{53640926-AAD7-44D8-BBD7-CCE9431645EC}">
+                      <a14:shadowObscured xmlns:a14="http://schemas.microsoft.com/office/drawing/2010/main"/>
+                    </a:ext>
+                  </a:extLst>
+                </pic:spPr>
+              </pic:pic>
+            </a:graphicData>
+          </a:graphic>
+          <wp14:sizeRelH relativeFrom="margin">
+            <wp14:pctWidth>0</wp14:pctWidth>
+          </wp14:sizeRelH>
+          <wp14:sizeRelV relativeFrom="margin">
+            <wp14:pctHeight>0</wp14:pctHeight>
+          </wp14:sizeRelV>
+        </wp:anchor>
+      </w:drawing>
+    </w:r>
+    <w:r>
+      <w:rPr>
+        <w:noProof/>
+        <w:lang w:eastAsia="es-CO"/>
+      </w:rPr>
+      <w:drawing>
+        <wp:anchor distT="0" distB="0" distL="114300" distR="114300" simplePos="0" relativeHeight="251672576" behindDoc="0" locked="0" layoutInCell="1" allowOverlap="1" wp14:anchorId="4865D704" wp14:editId="2F91AAAD">
           <wp:simplePos x="0" y="0"/>
           <wp:positionH relativeFrom="margin">
-            <wp:posOffset>4668520</wp:posOffset>
+            <wp:posOffset>4958715</wp:posOffset>
           </wp:positionH>
           <wp:positionV relativeFrom="margin">
-            <wp:posOffset>8302975</wp:posOffset>
+            <wp:posOffset>8434070</wp:posOffset>
           </wp:positionV>
-          <wp:extent cx="1457841" cy="623738"/>
+          <wp:extent cx="1457325" cy="623570"/>
           <wp:effectExtent l="0" t="0" r="9525" b="5080"/>
           <wp:wrapNone/>
           <wp:docPr id="12" name="Picture 12" descr="C:\Users\karagon\Pictures\ee.png"/>
@@ -75,7 +137,7 @@
                   </pic:cNvPicPr>
                 </pic:nvPicPr>
                 <pic:blipFill>
-                  <a:blip r:embed="rId1" cstate="print">
+                  <a:blip r:embed="rId2" cstate="print">
                     <a:extLst>
                       <a:ext uri="{28A0092B-C50C-407E-A947-70E740481C1C}">
                         <a14:useLocalDpi xmlns:a14="http://schemas.microsoft.com/office/drawing/2010/main" val="0"/>
@@ -90,7 +152,7 @@
                 <pic:spPr bwMode="auto">
                   <a:xfrm>
                     <a:off x="0" y="0"/>
-                    <a:ext cx="1457841" cy="623738"/>
+                    <a:ext cx="1457325" cy="623570"/>
                   </a:xfrm>
                   <a:prstGeom prst="rect">
                     <a:avLst/>
@@ -112,81 +174,6 @@
         </wp:anchor>
       </w:drawing>
     </w:r>
-    <w:r>
-      <w:rPr>
-        <w:noProof/>
-        <w:lang w:eastAsia="es-CO"/>
-      </w:rPr>
-      <w:drawing>
-        <wp:anchor distT="0" distB="0" distL="114300" distR="114300" simplePos="0" relativeHeight="251669504" behindDoc="0" locked="0" layoutInCell="1" allowOverlap="1" wp14:anchorId="37E6FDFB" wp14:editId="33AA5682">
-          <wp:simplePos x="0" y="0"/>
-          <wp:positionH relativeFrom="page">
-            <wp:posOffset>259080</wp:posOffset>
-          </wp:positionH>
-          <wp:positionV relativeFrom="paragraph">
-            <wp:posOffset>-406115</wp:posOffset>
-          </wp:positionV>
-          <wp:extent cx="5151755" cy="979170"/>
-          <wp:effectExtent l="0" t="0" r="0" b="0"/>
-          <wp:wrapThrough wrapText="bothSides">
-            <wp:wrapPolygon edited="0">
-              <wp:start x="1438" y="2942"/>
-              <wp:lineTo x="1358" y="4623"/>
-              <wp:lineTo x="1438" y="16389"/>
-              <wp:lineTo x="1597" y="17230"/>
-              <wp:lineTo x="3115" y="18070"/>
-              <wp:lineTo x="3834" y="18070"/>
-              <wp:lineTo x="5671" y="17230"/>
-              <wp:lineTo x="7907" y="13447"/>
-              <wp:lineTo x="7827" y="10506"/>
-              <wp:lineTo x="17811" y="7144"/>
-              <wp:lineTo x="17732" y="4202"/>
-              <wp:lineTo x="1997" y="2942"/>
-              <wp:lineTo x="1438" y="2942"/>
-            </wp:wrapPolygon>
-          </wp:wrapThrough>
-          <wp:docPr id="4118" name="2 Imagen" descr="net_GROUP_pie.png"/>
-          <wp:cNvGraphicFramePr>
-            <a:graphicFrameLocks xmlns:a="http://schemas.openxmlformats.org/drawingml/2006/main" noChangeAspect="1"/>
-          </wp:cNvGraphicFramePr>
-          <a:graphic xmlns:a="http://schemas.openxmlformats.org/drawingml/2006/main">
-            <a:graphicData uri="http://schemas.openxmlformats.org/drawingml/2006/picture">
-              <pic:pic xmlns:pic="http://schemas.openxmlformats.org/drawingml/2006/picture">
-                <pic:nvPicPr>
-                  <pic:cNvPr id="0" name="net_GROUP_pie.png"/>
-                  <pic:cNvPicPr/>
-                </pic:nvPicPr>
-                <pic:blipFill rotWithShape="1">
-                  <a:blip r:embed="rId2"/>
-                  <a:srcRect r="27561"/>
-                  <a:stretch/>
-                </pic:blipFill>
-                <pic:spPr bwMode="auto">
-                  <a:xfrm>
-                    <a:off x="0" y="0"/>
-                    <a:ext cx="5151755" cy="979170"/>
-                  </a:xfrm>
-                  <a:prstGeom prst="rect">
-                    <a:avLst/>
-                  </a:prstGeom>
-                  <a:ln>
-                    <a:noFill/>
-                  </a:ln>
-                  <a:extLst>
-                    <a:ext uri="{53640926-AAD7-44D8-BBD7-CCE9431645EC}">
-                      <a14:shadowObscured xmlns:a14="http://schemas.microsoft.com/office/drawing/2010/main"/>
-                    </a:ext>
-                  </a:extLst>
-                </pic:spPr>
-              </pic:pic>
-            </a:graphicData>
-          </a:graphic>
-          <wp14:sizeRelH relativeFrom="margin">
-            <wp14:pctWidth>0</wp14:pctWidth>
-          </wp14:sizeRelH>
-        </wp:anchor>
-      </w:drawing>
-    </w:r>
   </w:p>
 </w:ftr>
 </file>
@@ -207,8 +194,154 @@
         <w:noProof/>
         <w:lang w:eastAsia="es-CO"/>
       </w:rPr>
+      <mc:AlternateContent>
+        <mc:Choice Requires="wpg">
+          <w:drawing>
+            <wp:anchor distT="0" distB="0" distL="114300" distR="114300" simplePos="0" relativeHeight="251680768" behindDoc="1" locked="0" layoutInCell="1" allowOverlap="1" wp14:anchorId="110830BF" wp14:editId="32AAB1A0">
+              <wp:simplePos x="0" y="0"/>
+              <wp:positionH relativeFrom="margin">
+                <wp:posOffset>-852170</wp:posOffset>
+              </wp:positionH>
+              <wp:positionV relativeFrom="page">
+                <wp:posOffset>9277350</wp:posOffset>
+              </wp:positionV>
+              <wp:extent cx="7172325" cy="749935"/>
+              <wp:effectExtent l="0" t="0" r="0" b="0"/>
+              <wp:wrapTopAndBottom/>
+              <wp:docPr id="48" name="Group 48"/>
+              <wp:cNvGraphicFramePr/>
+              <a:graphic xmlns:a="http://schemas.openxmlformats.org/drawingml/2006/main">
+                <a:graphicData uri="http://schemas.microsoft.com/office/word/2010/wordprocessingGroup">
+                  <wpg:wgp>
+                    <wpg:cNvGrpSpPr/>
+                    <wpg:grpSpPr>
+                      <a:xfrm>
+                        <a:off x="0" y="0"/>
+                        <a:ext cx="7172325" cy="749935"/>
+                        <a:chOff x="357352" y="861848"/>
+                        <a:chExt cx="6820732" cy="979170"/>
+                      </a:xfrm>
+                    </wpg:grpSpPr>
+                    <pic:pic xmlns:pic="http://schemas.openxmlformats.org/drawingml/2006/picture">
+                      <pic:nvPicPr>
+                        <pic:cNvPr id="39" name="2 Imagen" descr="net_GROUP_pie.png"/>
+                        <pic:cNvPicPr>
+                          <a:picLocks noChangeAspect="1"/>
+                        </pic:cNvPicPr>
+                      </pic:nvPicPr>
+                      <pic:blipFill rotWithShape="1">
+                        <a:blip r:embed="rId1"/>
+                        <a:srcRect r="27561"/>
+                        <a:stretch/>
+                      </pic:blipFill>
+                      <pic:spPr bwMode="auto">
+                        <a:xfrm>
+                          <a:off x="357352" y="861848"/>
+                          <a:ext cx="5151755" cy="979170"/>
+                        </a:xfrm>
+                        <a:prstGeom prst="rect">
+                          <a:avLst/>
+                        </a:prstGeom>
+                        <a:ln>
+                          <a:noFill/>
+                        </a:ln>
+                        <a:extLst>
+                          <a:ext uri="{53640926-AAD7-44D8-BBD7-CCE9431645EC}">
+                            <a14:shadowObscured xmlns:a14="http://schemas.microsoft.com/office/drawing/2010/main"/>
+                          </a:ext>
+                        </a:extLst>
+                      </pic:spPr>
+                    </pic:pic>
+                    <pic:pic xmlns:pic="http://schemas.openxmlformats.org/drawingml/2006/picture">
+                      <pic:nvPicPr>
+                        <pic:cNvPr id="46" name="Picture 46" descr="C:\Users\karagon\Pictures\Sin título-1.png"/>
+                        <pic:cNvPicPr>
+                          <a:picLocks noChangeAspect="1"/>
+                        </pic:cNvPicPr>
+                      </pic:nvPicPr>
+                      <pic:blipFill rotWithShape="1">
+                        <a:blip r:embed="rId2">
+                          <a:extLst>
+                            <a:ext uri="{28A0092B-C50C-407E-A947-70E740481C1C}">
+                              <a14:useLocalDpi xmlns:a14="http://schemas.microsoft.com/office/drawing/2010/main" val="0"/>
+                            </a:ext>
+                          </a:extLst>
+                        </a:blip>
+                        <a:srcRect t="16674"/>
+                        <a:stretch/>
+                      </pic:blipFill>
+                      <pic:spPr bwMode="auto">
+                        <a:xfrm>
+                          <a:off x="5602014" y="1030013"/>
+                          <a:ext cx="1576070" cy="787400"/>
+                        </a:xfrm>
+                        <a:prstGeom prst="rect">
+                          <a:avLst/>
+                        </a:prstGeom>
+                        <a:noFill/>
+                        <a:ln>
+                          <a:noFill/>
+                        </a:ln>
+                        <a:extLst>
+                          <a:ext uri="{53640926-AAD7-44D8-BBD7-CCE9431645EC}">
+                            <a14:shadowObscured xmlns:a14="http://schemas.microsoft.com/office/drawing/2010/main"/>
+                          </a:ext>
+                        </a:extLst>
+                      </pic:spPr>
+                    </pic:pic>
+                  </wpg:wgp>
+                </a:graphicData>
+              </a:graphic>
+              <wp14:sizeRelH relativeFrom="margin">
+                <wp14:pctWidth>0</wp14:pctWidth>
+              </wp14:sizeRelH>
+              <wp14:sizeRelV relativeFrom="margin">
+                <wp14:pctHeight>0</wp14:pctHeight>
+              </wp14:sizeRelV>
+            </wp:anchor>
+          </w:drawing>
+        </mc:Choice>
+        <mc:Fallback>
+          <w:pict>
+            <v:group w14:anchorId="2D43FDB4" id="Group 48" o:spid="_x0000_s1026" style="position:absolute;margin-left:-67.1pt;margin-top:730.5pt;width:564.75pt;height:59.05pt;z-index:-251635712;mso-position-horizontal-relative:margin;mso-position-vertical-relative:page;mso-width-relative:margin;mso-height-relative:margin" coordorigin="3573,8618" coordsize="68207,9791" o:gfxdata="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">
+              <v:shapetype id="_x0000_t75" coordsize="21600,21600" o:spt="75" o:preferrelative="t" path="m@4@5l@4@11@9@11@9@5xe" filled="f" stroked="f">
+                <v:stroke joinstyle="miter"/>
+                <v:formulas>
+                  <v:f eqn="if lineDrawn pixelLineWidth 0"/>
+                  <v:f eqn="sum @0 1 0"/>
+                  <v:f eqn="sum 0 0 @1"/>
+                  <v:f eqn="prod @2 1 2"/>
+                  <v:f eqn="prod @3 21600 pixelWidth"/>
+                  <v:f eqn="prod @3 21600 pixelHeight"/>
+                  <v:f eqn="sum @0 0 1"/>
+                  <v:f eqn="prod @6 1 2"/>
+                  <v:f eqn="prod @7 21600 pixelWidth"/>
+                  <v:f eqn="sum @8 21600 0"/>
+                  <v:f eqn="prod @7 21600 pixelHeight"/>
+                  <v:f eqn="sum @10 21600 0"/>
+                </v:formulas>
+                <v:path o:extrusionok="f" gradientshapeok="t" o:connecttype="rect"/>
+                <o:lock v:ext="edit" aspectratio="t"/>
+              </v:shapetype>
+              <v:shape id="2 Imagen" o:spid="_x0000_s1027" type="#_x0000_t75" alt="net_GROUP_pie.png" style="position:absolute;left:3573;top:8618;width:51518;height:9792;visibility:visible;mso-wrap-style:square" o:gfxdata="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">
+                <v:imagedata r:id="rId3" o:title="net_GROUP_pie" cropright="18062f"/>
+              </v:shape>
+              <v:shape id="Picture 46" o:spid="_x0000_s1028" type="#_x0000_t75" style="position:absolute;left:56020;top:10300;width:15760;height:7874;visibility:visible;mso-wrap-style:square" o:gfxdata="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">
+                <v:imagedata r:id="rId4" o:title="Sin título-1" croptop="10927f"/>
+              </v:shape>
+              <w10:wrap type="topAndBottom" anchorx="margin" anchory="page"/>
+            </v:group>
+          </w:pict>
+        </mc:Fallback>
+      </mc:AlternateContent>
+    </w:r>
+    <w:r>
+      <w:rPr>
+        <w:noProof/>
+        <w:lang w:eastAsia="es-CO"/>
+      </w:rPr>
       <w:drawing>
-        <wp:anchor distT="0" distB="0" distL="114300" distR="114300" simplePos="0" relativeHeight="251688960" behindDoc="1" locked="0" layoutInCell="1" allowOverlap="1" wp14:anchorId="44203147" wp14:editId="5D877AE3">
+        <wp:anchor distT="0" distB="0" distL="114300" distR="114300" simplePos="0" relativeHeight="251688960" behindDoc="1" locked="0" layoutInCell="1" allowOverlap="1" wp14:anchorId="44203147" wp14:editId="1999C13C">
           <wp:simplePos x="0" y="0"/>
           <wp:positionH relativeFrom="page">
             <wp:align>left</wp:align>
@@ -233,11 +366,11 @@
                   </pic:cNvPicPr>
                 </pic:nvPicPr>
                 <pic:blipFill>
-                  <a:blip r:embed="rId1">
+                  <a:blip r:embed="rId5">
                     <a:extLst>
                       <a:ext uri="{BEBA8EAE-BF5A-486C-A8C5-ECC9F3942E4B}">
                         <a14:imgProps xmlns:a14="http://schemas.microsoft.com/office/drawing/2010/main">
-                          <a14:imgLayer r:embed="rId2">
+                          <a14:imgLayer r:embed="rId6">
                             <a14:imgEffect>
                               <a14:saturation sat="66000"/>
                             </a14:imgEffect>
@@ -280,152 +413,6 @@
       </w:drawing>
     </w:r>
     <w:r>
-      <w:rPr>
-        <w:noProof/>
-        <w:lang w:eastAsia="es-CO"/>
-      </w:rPr>
-      <mc:AlternateContent>
-        <mc:Choice Requires="wpg">
-          <w:drawing>
-            <wp:anchor distT="0" distB="0" distL="114300" distR="114300" simplePos="0" relativeHeight="251680768" behindDoc="1" locked="0" layoutInCell="1" allowOverlap="1" wp14:anchorId="110830BF" wp14:editId="767A7BA2">
-              <wp:simplePos x="0" y="0"/>
-              <wp:positionH relativeFrom="margin">
-                <wp:posOffset>-651510</wp:posOffset>
-              </wp:positionH>
-              <wp:positionV relativeFrom="page">
-                <wp:posOffset>9048750</wp:posOffset>
-              </wp:positionV>
-              <wp:extent cx="6820535" cy="978535"/>
-              <wp:effectExtent l="0" t="0" r="0" b="0"/>
-              <wp:wrapTopAndBottom/>
-              <wp:docPr id="48" name="Group 48"/>
-              <wp:cNvGraphicFramePr/>
-              <a:graphic xmlns:a="http://schemas.openxmlformats.org/drawingml/2006/main">
-                <a:graphicData uri="http://schemas.microsoft.com/office/word/2010/wordprocessingGroup">
-                  <wpg:wgp>
-                    <wpg:cNvGrpSpPr/>
-                    <wpg:grpSpPr>
-                      <a:xfrm>
-                        <a:off x="0" y="0"/>
-                        <a:ext cx="6820535" cy="978535"/>
-                        <a:chOff x="357352" y="861848"/>
-                        <a:chExt cx="6820732" cy="979170"/>
-                      </a:xfrm>
-                    </wpg:grpSpPr>
-                    <pic:pic xmlns:pic="http://schemas.openxmlformats.org/drawingml/2006/picture">
-                      <pic:nvPicPr>
-                        <pic:cNvPr id="39" name="2 Imagen" descr="net_GROUP_pie.png"/>
-                        <pic:cNvPicPr>
-                          <a:picLocks noChangeAspect="1"/>
-                        </pic:cNvPicPr>
-                      </pic:nvPicPr>
-                      <pic:blipFill rotWithShape="1">
-                        <a:blip r:embed="rId3"/>
-                        <a:srcRect r="27561"/>
-                        <a:stretch/>
-                      </pic:blipFill>
-                      <pic:spPr bwMode="auto">
-                        <a:xfrm>
-                          <a:off x="357352" y="861848"/>
-                          <a:ext cx="5151755" cy="979170"/>
-                        </a:xfrm>
-                        <a:prstGeom prst="rect">
-                          <a:avLst/>
-                        </a:prstGeom>
-                        <a:ln>
-                          <a:noFill/>
-                        </a:ln>
-                        <a:extLst>
-                          <a:ext uri="{53640926-AAD7-44D8-BBD7-CCE9431645EC}">
-                            <a14:shadowObscured xmlns:a14="http://schemas.microsoft.com/office/drawing/2010/main"/>
-                          </a:ext>
-                        </a:extLst>
-                      </pic:spPr>
-                    </pic:pic>
-                    <pic:pic xmlns:pic="http://schemas.openxmlformats.org/drawingml/2006/picture">
-                      <pic:nvPicPr>
-                        <pic:cNvPr id="46" name="Picture 46" descr="C:\Users\karagon\Pictures\Sin título-1.png"/>
-                        <pic:cNvPicPr>
-                          <a:picLocks noChangeAspect="1"/>
-                        </pic:cNvPicPr>
-                      </pic:nvPicPr>
-                      <pic:blipFill rotWithShape="1">
-                        <a:blip r:embed="rId4">
-                          <a:extLst>
-                            <a:ext uri="{28A0092B-C50C-407E-A947-70E740481C1C}">
-                              <a14:useLocalDpi xmlns:a14="http://schemas.microsoft.com/office/drawing/2010/main" val="0"/>
-                            </a:ext>
-                          </a:extLst>
-                        </a:blip>
-                        <a:srcRect t="16674"/>
-                        <a:stretch/>
-                      </pic:blipFill>
-                      <pic:spPr bwMode="auto">
-                        <a:xfrm>
-                          <a:off x="5602014" y="1030013"/>
-                          <a:ext cx="1576070" cy="787400"/>
-                        </a:xfrm>
-                        <a:prstGeom prst="rect">
-                          <a:avLst/>
-                        </a:prstGeom>
-                        <a:noFill/>
-                        <a:ln>
-                          <a:noFill/>
-                        </a:ln>
-                        <a:extLst>
-                          <a:ext uri="{53640926-AAD7-44D8-BBD7-CCE9431645EC}">
-                            <a14:shadowObscured xmlns:a14="http://schemas.microsoft.com/office/drawing/2010/main"/>
-                          </a:ext>
-                        </a:extLst>
-                      </pic:spPr>
-                    </pic:pic>
-                  </wpg:wgp>
-                </a:graphicData>
-              </a:graphic>
-              <wp14:sizeRelH relativeFrom="margin">
-                <wp14:pctWidth>0</wp14:pctWidth>
-              </wp14:sizeRelH>
-              <wp14:sizeRelV relativeFrom="margin">
-                <wp14:pctHeight>0</wp14:pctHeight>
-              </wp14:sizeRelV>
-            </wp:anchor>
-          </w:drawing>
-        </mc:Choice>
-        <mc:Fallback>
-          <w:pict>
-            <v:group w14:anchorId="401152E3" id="Group 48" o:spid="_x0000_s1026" style="position:absolute;margin-left:-51.3pt;margin-top:712.5pt;width:537.05pt;height:77.05pt;z-index:-251635712;mso-position-horizontal-relative:margin;mso-position-vertical-relative:page;mso-width-relative:margin;mso-height-relative:margin" coordorigin="3573,8618" coordsize="68207,9791" o:gfxdata="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">
-              <v:shapetype id="_x0000_t75" coordsize="21600,21600" o:spt="75" o:preferrelative="t" path="m@4@5l@4@11@9@11@9@5xe" filled="f" stroked="f">
-                <v:stroke joinstyle="miter"/>
-                <v:formulas>
-                  <v:f eqn="if lineDrawn pixelLineWidth 0"/>
-                  <v:f eqn="sum @0 1 0"/>
-                  <v:f eqn="sum 0 0 @1"/>
-                  <v:f eqn="prod @2 1 2"/>
-                  <v:f eqn="prod @3 21600 pixelWidth"/>
-                  <v:f eqn="prod @3 21600 pixelHeight"/>
-                  <v:f eqn="sum @0 0 1"/>
-                  <v:f eqn="prod @6 1 2"/>
-                  <v:f eqn="prod @7 21600 pixelWidth"/>
-                  <v:f eqn="sum @8 21600 0"/>
-                  <v:f eqn="prod @7 21600 pixelHeight"/>
-                  <v:f eqn="sum @10 21600 0"/>
-                </v:formulas>
-                <v:path o:extrusionok="f" gradientshapeok="t" o:connecttype="rect"/>
-                <o:lock v:ext="edit" aspectratio="t"/>
-              </v:shapetype>
-              <v:shape id="2 Imagen" o:spid="_x0000_s1027" type="#_x0000_t75" alt="net_GROUP_pie.png" style="position:absolute;left:3573;top:8618;width:51518;height:9792;visibility:visible;mso-wrap-style:square" o:gfxdata="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">
-                <v:imagedata r:id="rId5" o:title="net_GROUP_pie" cropright="18062f"/>
-              </v:shape>
-              <v:shape id="Picture 46" o:spid="_x0000_s1028" type="#_x0000_t75" style="position:absolute;left:56020;top:10300;width:15760;height:7874;visibility:visible;mso-wrap-style:square" o:gfxdata="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">
-                <v:imagedata r:id="rId6" o:title="Sin título-1" croptop="10927f"/>
-              </v:shape>
-              <w10:wrap type="topAndBottom" anchorx="margin" anchory="page"/>
-            </v:group>
-          </w:pict>
-        </mc:Fallback>
-      </mc:AlternateContent>
-    </w:r>
-    <w:r>
       <w:tab/>
     </w:r>
   </w:p>
@@ -468,78 +455,16 @@
         <w:lang w:eastAsia="es-CO"/>
       </w:rPr>
       <w:drawing>
-        <wp:anchor distT="0" distB="0" distL="114300" distR="114300" simplePos="0" relativeHeight="251691008" behindDoc="0" locked="0" layoutInCell="1" allowOverlap="1" wp14:anchorId="26E9FA56" wp14:editId="5DE02BA3">
-          <wp:simplePos x="0" y="0"/>
-          <wp:positionH relativeFrom="column">
-            <wp:posOffset>-952500</wp:posOffset>
-          </wp:positionH>
-          <wp:positionV relativeFrom="paragraph">
-            <wp:posOffset>-453390</wp:posOffset>
-          </wp:positionV>
-          <wp:extent cx="1197610" cy="682625"/>
-          <wp:effectExtent l="0" t="0" r="0" b="3175"/>
-          <wp:wrapNone/>
-          <wp:docPr id="42" name="Picture 42" descr="C:\Users\karagon\Documents\Net-Group-SA-blanco.png"/>
-          <wp:cNvGraphicFramePr>
-            <a:graphicFrameLocks xmlns:a="http://schemas.openxmlformats.org/drawingml/2006/main" noChangeAspect="1"/>
-          </wp:cNvGraphicFramePr>
-          <a:graphic xmlns:a="http://schemas.openxmlformats.org/drawingml/2006/main">
-            <a:graphicData uri="http://schemas.openxmlformats.org/drawingml/2006/picture">
-              <pic:pic xmlns:pic="http://schemas.openxmlformats.org/drawingml/2006/picture">
-                <pic:nvPicPr>
-                  <pic:cNvPr id="42" name="Picture 42" descr="C:\Users\karagon\Documents\Net-Group-SA-blanco.png"/>
-                  <pic:cNvPicPr>
-                    <a:picLocks noChangeAspect="1"/>
-                  </pic:cNvPicPr>
-                </pic:nvPicPr>
-                <pic:blipFill>
-                  <a:blip r:embed="rId1">
-                    <a:extLst>
-                      <a:ext uri="{28A0092B-C50C-407E-A947-70E740481C1C}">
-                        <a14:useLocalDpi xmlns:a14="http://schemas.microsoft.com/office/drawing/2010/main" val="0"/>
-                      </a:ext>
-                    </a:extLst>
-                  </a:blip>
-                  <a:srcRect/>
-                  <a:stretch>
-                    <a:fillRect/>
-                  </a:stretch>
-                </pic:blipFill>
-                <pic:spPr bwMode="auto">
-                  <a:xfrm>
-                    <a:off x="0" y="0"/>
-                    <a:ext cx="1197610" cy="682625"/>
-                  </a:xfrm>
-                  <a:prstGeom prst="rect">
-                    <a:avLst/>
-                  </a:prstGeom>
-                  <a:noFill/>
-                  <a:ln>
-                    <a:noFill/>
-                  </a:ln>
-                </pic:spPr>
-              </pic:pic>
-            </a:graphicData>
-          </a:graphic>
-        </wp:anchor>
-      </w:drawing>
-    </w:r>
-    <w:r>
-      <w:rPr>
-        <w:noProof/>
-        <w:lang w:eastAsia="es-CO"/>
-      </w:rPr>
-      <w:drawing>
-        <wp:anchor distT="0" distB="0" distL="114300" distR="114300" simplePos="0" relativeHeight="251693056" behindDoc="1" locked="0" layoutInCell="1" allowOverlap="1" wp14:anchorId="680FB6C9" wp14:editId="0B43D092">
+        <wp:anchor distT="0" distB="0" distL="114300" distR="114300" simplePos="0" relativeHeight="251693056" behindDoc="1" locked="0" layoutInCell="1" allowOverlap="1" wp14:anchorId="680FB6C9" wp14:editId="28B14F23">
           <wp:simplePos x="0" y="0"/>
           <wp:positionH relativeFrom="page">
-            <wp:posOffset>12116</wp:posOffset>
+            <wp:posOffset>12065</wp:posOffset>
           </wp:positionH>
           <wp:positionV relativeFrom="page">
-            <wp:posOffset>20142</wp:posOffset>
+            <wp:align>top</wp:align>
           </wp:positionV>
-          <wp:extent cx="7785735" cy="632298"/>
-          <wp:effectExtent l="0" t="0" r="0" b="0"/>
+          <wp:extent cx="7785735" cy="631825"/>
+          <wp:effectExtent l="0" t="0" r="5715" b="0"/>
           <wp:wrapNone/>
           <wp:docPr id="2" name="Picture 2" descr="C:\Users\karagon\Pictures\rojo.png"/>
           <wp:cNvGraphicFramePr>
@@ -555,11 +480,11 @@
                   </pic:cNvPicPr>
                 </pic:nvPicPr>
                 <pic:blipFill rotWithShape="1">
-                  <a:blip r:embed="rId2">
+                  <a:blip r:embed="rId1">
                     <a:extLst>
                       <a:ext uri="{BEBA8EAE-BF5A-486C-A8C5-ECC9F3942E4B}">
                         <a14:imgProps xmlns:a14="http://schemas.microsoft.com/office/drawing/2010/main">
-                          <a14:imgLayer r:embed="rId3">
+                          <a14:imgLayer r:embed="rId2">
                             <a14:imgEffect>
                               <a14:saturation sat="66000"/>
                             </a14:imgEffect>
@@ -577,7 +502,7 @@
                 <pic:spPr bwMode="auto">
                   <a:xfrm flipH="1">
                     <a:off x="0" y="0"/>
-                    <a:ext cx="7785735" cy="632298"/>
+                    <a:ext cx="7785735" cy="631825"/>
                   </a:xfrm>
                   <a:prstGeom prst="rect">
                     <a:avLst/>
@@ -591,6 +516,73 @@
                       <a14:shadowObscured xmlns:a14="http://schemas.microsoft.com/office/drawing/2010/main"/>
                     </a:ext>
                   </a:extLst>
+                </pic:spPr>
+              </pic:pic>
+            </a:graphicData>
+          </a:graphic>
+          <wp14:sizeRelH relativeFrom="margin">
+            <wp14:pctWidth>0</wp14:pctWidth>
+          </wp14:sizeRelH>
+          <wp14:sizeRelV relativeFrom="margin">
+            <wp14:pctHeight>0</wp14:pctHeight>
+          </wp14:sizeRelV>
+        </wp:anchor>
+      </w:drawing>
+    </w:r>
+    <w:r>
+      <w:rPr>
+        <w:noProof/>
+      </w:rPr>
+      <w:drawing>
+        <wp:anchor distT="0" distB="0" distL="114300" distR="114300" simplePos="0" relativeHeight="251694080" behindDoc="0" locked="0" layoutInCell="1" allowOverlap="1" wp14:anchorId="65E2385F" wp14:editId="096BD2D0">
+          <wp:simplePos x="0" y="0"/>
+          <wp:positionH relativeFrom="leftMargin">
+            <wp:align>right</wp:align>
+          </wp:positionH>
+          <wp:positionV relativeFrom="paragraph">
+            <wp:posOffset>-373380</wp:posOffset>
+          </wp:positionV>
+          <wp:extent cx="819150" cy="523607"/>
+          <wp:effectExtent l="0" t="0" r="0" b="0"/>
+          <wp:wrapNone/>
+          <wp:docPr id="268819248" name="Imagen 2"/>
+          <wp:cNvGraphicFramePr>
+            <a:graphicFrameLocks xmlns:a="http://schemas.openxmlformats.org/drawingml/2006/main" noChangeAspect="1"/>
+          </wp:cNvGraphicFramePr>
+          <a:graphic xmlns:a="http://schemas.openxmlformats.org/drawingml/2006/main">
+            <a:graphicData uri="http://schemas.openxmlformats.org/drawingml/2006/picture">
+              <pic:pic xmlns:pic="http://schemas.openxmlformats.org/drawingml/2006/picture">
+                <pic:nvPicPr>
+                  <pic:cNvPr id="0" name="Picture 3"/>
+                  <pic:cNvPicPr>
+                    <a:picLocks noChangeAspect="1" noChangeArrowheads="1"/>
+                  </pic:cNvPicPr>
+                </pic:nvPicPr>
+                <pic:blipFill>
+                  <a:blip r:embed="rId3">
+                    <a:extLst>
+                      <a:ext uri="{28A0092B-C50C-407E-A947-70E740481C1C}">
+                        <a14:useLocalDpi xmlns:a14="http://schemas.microsoft.com/office/drawing/2010/main" val="0"/>
+                      </a:ext>
+                    </a:extLst>
+                  </a:blip>
+                  <a:srcRect/>
+                  <a:stretch>
+                    <a:fillRect/>
+                  </a:stretch>
+                </pic:blipFill>
+                <pic:spPr bwMode="auto">
+                  <a:xfrm>
+                    <a:off x="0" y="0"/>
+                    <a:ext cx="819150" cy="523607"/>
+                  </a:xfrm>
+                  <a:prstGeom prst="rect">
+                    <a:avLst/>
+                  </a:prstGeom>
+                  <a:noFill/>
+                  <a:ln>
+                    <a:noFill/>
+                  </a:ln>
                 </pic:spPr>
               </pic:pic>
             </a:graphicData>
@@ -629,21 +621,20 @@
     <w:r>
       <w:rPr>
         <w:noProof/>
-        <w:lang w:eastAsia="es-CO"/>
       </w:rPr>
       <w:drawing>
-        <wp:anchor distT="0" distB="0" distL="114300" distR="114300" simplePos="0" relativeHeight="251686912" behindDoc="1" locked="0" layoutInCell="1" allowOverlap="1" wp14:anchorId="60E58C16" wp14:editId="3D7CC437">
+        <wp:anchor distT="0" distB="0" distL="114300" distR="114300" simplePos="0" relativeHeight="251696128" behindDoc="0" locked="0" layoutInCell="1" allowOverlap="1" wp14:anchorId="7D1883F6" wp14:editId="1E32D7E5">
           <wp:simplePos x="0" y="0"/>
-          <wp:positionH relativeFrom="page">
-            <wp:align>left</wp:align>
+          <wp:positionH relativeFrom="leftMargin">
+            <wp:posOffset>123825</wp:posOffset>
           </wp:positionH>
-          <wp:positionV relativeFrom="margin">
-            <wp:posOffset>-880340</wp:posOffset>
+          <wp:positionV relativeFrom="paragraph">
+            <wp:posOffset>-392431</wp:posOffset>
           </wp:positionV>
-          <wp:extent cx="7744973" cy="1935805"/>
-          <wp:effectExtent l="0" t="0" r="0" b="7620"/>
+          <wp:extent cx="1171575" cy="804401"/>
+          <wp:effectExtent l="0" t="0" r="0" b="0"/>
           <wp:wrapNone/>
-          <wp:docPr id="6" name="Picture 6"/>
+          <wp:docPr id="1176868827" name="Imagen 2"/>
           <wp:cNvGraphicFramePr>
             <a:graphicFrameLocks xmlns:a="http://schemas.openxmlformats.org/drawingml/2006/main" noChangeAspect="1"/>
           </wp:cNvGraphicFramePr>
@@ -651,38 +642,103 @@
             <a:graphicData uri="http://schemas.openxmlformats.org/drawingml/2006/picture">
               <pic:pic xmlns:pic="http://schemas.openxmlformats.org/drawingml/2006/picture">
                 <pic:nvPicPr>
-                  <pic:cNvPr id="6" name="rojo.png"/>
-                  <pic:cNvPicPr/>
+                  <pic:cNvPr id="0" name="Picture 3"/>
+                  <pic:cNvPicPr>
+                    <a:picLocks noChangeAspect="1" noChangeArrowheads="1"/>
+                  </pic:cNvPicPr>
                 </pic:nvPicPr>
                 <pic:blipFill>
-                  <a:blip r:embed="rId1" cstate="print">
+                  <a:blip r:embed="rId1">
                     <a:extLst>
-                      <a:ext uri="{BEBA8EAE-BF5A-486C-A8C5-ECC9F3942E4B}">
-                        <a14:imgProps xmlns:a14="http://schemas.microsoft.com/office/drawing/2010/main">
-                          <a14:imgLayer r:embed="rId2">
-                            <a14:imgEffect>
-                              <a14:saturation sat="66000"/>
-                            </a14:imgEffect>
-                          </a14:imgLayer>
-                        </a14:imgProps>
-                      </a:ext>
                       <a:ext uri="{28A0092B-C50C-407E-A947-70E740481C1C}">
                         <a14:useLocalDpi xmlns:a14="http://schemas.microsoft.com/office/drawing/2010/main" val="0"/>
                       </a:ext>
                     </a:extLst>
                   </a:blip>
+                  <a:srcRect/>
                   <a:stretch>
                     <a:fillRect/>
                   </a:stretch>
                 </pic:blipFill>
-                <pic:spPr>
+                <pic:spPr bwMode="auto">
                   <a:xfrm>
                     <a:off x="0" y="0"/>
-                    <a:ext cx="7744973" cy="1935805"/>
+                    <a:ext cx="1172900" cy="805311"/>
                   </a:xfrm>
                   <a:prstGeom prst="rect">
                     <a:avLst/>
                   </a:prstGeom>
+                  <a:noFill/>
+                  <a:ln>
+                    <a:noFill/>
+                  </a:ln>
+                </pic:spPr>
+              </pic:pic>
+            </a:graphicData>
+          </a:graphic>
+          <wp14:sizeRelH relativeFrom="margin">
+            <wp14:pctWidth>0</wp14:pctWidth>
+          </wp14:sizeRelH>
+          <wp14:sizeRelV relativeFrom="margin">
+            <wp14:pctHeight>0</wp14:pctHeight>
+          </wp14:sizeRelV>
+        </wp:anchor>
+      </w:drawing>
+    </w:r>
+    <w:r>
+      <w:rPr>
+        <w:noProof/>
+      </w:rPr>
+      <w:drawing>
+        <wp:anchor distT="0" distB="0" distL="114300" distR="114300" simplePos="0" relativeHeight="251695104" behindDoc="0" locked="0" layoutInCell="1" allowOverlap="1" wp14:anchorId="16EAB445" wp14:editId="2EA30B3B">
+          <wp:simplePos x="0" y="0"/>
+          <wp:positionH relativeFrom="page">
+            <wp:align>right</wp:align>
+          </wp:positionH>
+          <wp:positionV relativeFrom="paragraph">
+            <wp:posOffset>-640080</wp:posOffset>
+          </wp:positionV>
+          <wp:extent cx="7772400" cy="1524000"/>
+          <wp:effectExtent l="0" t="0" r="0" b="0"/>
+          <wp:wrapNone/>
+          <wp:docPr id="1911779760" name="Imagen 1"/>
+          <wp:cNvGraphicFramePr>
+            <a:graphicFrameLocks xmlns:a="http://schemas.openxmlformats.org/drawingml/2006/main" noChangeAspect="1"/>
+          </wp:cNvGraphicFramePr>
+          <a:graphic xmlns:a="http://schemas.openxmlformats.org/drawingml/2006/main">
+            <a:graphicData uri="http://schemas.openxmlformats.org/drawingml/2006/picture">
+              <pic:pic xmlns:pic="http://schemas.openxmlformats.org/drawingml/2006/picture">
+                <pic:nvPicPr>
+                  <pic:cNvPr id="0" name="Picture 1"/>
+                  <pic:cNvPicPr>
+                    <a:picLocks noChangeAspect="1" noChangeArrowheads="1"/>
+                  </pic:cNvPicPr>
+                </pic:nvPicPr>
+                <pic:blipFill>
+                  <a:blip r:embed="rId2">
+                    <a:extLst>
+                      <a:ext uri="{28A0092B-C50C-407E-A947-70E740481C1C}">
+                        <a14:useLocalDpi xmlns:a14="http://schemas.microsoft.com/office/drawing/2010/main" val="0"/>
+                      </a:ext>
+                    </a:extLst>
+                  </a:blip>
+                  <a:srcRect/>
+                  <a:stretch>
+                    <a:fillRect/>
+                  </a:stretch>
+                </pic:blipFill>
+                <pic:spPr bwMode="auto">
+                  <a:xfrm>
+                    <a:off x="0" y="0"/>
+                    <a:ext cx="7772400" cy="1524000"/>
+                  </a:xfrm>
+                  <a:prstGeom prst="rect">
+                    <a:avLst/>
+                  </a:prstGeom>
+                  <a:noFill/>
+                  <a:ln>
+                    <a:noFill/>
+                  </a:ln>
                 </pic:spPr>
               </pic:pic>
             </a:graphicData>
@@ -2387,6 +2443,15 @@
 </file>
 
 <file path=customXml/item1.xml><?xml version="1.0" encoding="utf-8"?>
+<?mso-contentType ?>
+<FormTemplates xmlns="http://schemas.microsoft.com/sharepoint/v3/contenttype/forms">
+  <Display>DocumentLibraryForm</Display>
+  <Edit>DocumentLibraryForm</Edit>
+  <New>DocumentLibraryForm</New>
+</FormTemplates>
+</file>
+
+<file path=customXml/item2.xml><?xml version="1.0" encoding="utf-8"?>
 <ct:contentTypeSchema xmlns:ct="http://schemas.microsoft.com/office/2006/metadata/contentType" xmlns:ma="http://schemas.microsoft.com/office/2006/metadata/properties/metaAttributes" ct:_="" ma:_="" ma:contentTypeName="Documento" ma:contentTypeID="0x01010018CB7E971FEE164C98FC560B88D6952C" ma:contentTypeVersion="2" ma:contentTypeDescription="Crear nuevo documento." ma:contentTypeScope="" ma:versionID="5d7d805f7feebc4e184084056b635bdd">
   <xsd:schema xmlns:xsd="http://www.w3.org/2001/XMLSchema" xmlns:xs="http://www.w3.org/2001/XMLSchema" xmlns:p="http://schemas.microsoft.com/office/2006/metadata/properties" xmlns:ns1="http://schemas.microsoft.com/sharepoint/v3" xmlns:ns2="c0a28601-0bac-47cc-9244-cdb4dbac3706" targetNamespace="http://schemas.microsoft.com/office/2006/metadata/properties" ma:root="true" ma:fieldsID="362c2595ded0cd39539dba7b51497e9a" ns1:_="" ns2:_="">
     <xsd:import namespace="http://schemas.microsoft.com/sharepoint/v3"/>
@@ -2543,20 +2608,7 @@
 </ct:contentTypeSchema>
 </file>
 
-<file path=customXml/item2.xml><?xml version="1.0" encoding="utf-8"?>
-<?mso-contentType ?>
-<FormTemplates xmlns="http://schemas.microsoft.com/sharepoint/v3/contenttype/forms">
-  <Display>DocumentLibraryForm</Display>
-  <Edit>DocumentLibraryForm</Edit>
-  <New>DocumentLibraryForm</New>
-</FormTemplates>
-</file>
-
 <file path=customXml/item3.xml><?xml version="1.0" encoding="utf-8"?>
-<b:Sources xmlns:b="http://schemas.openxmlformats.org/officeDocument/2006/bibliography" xmlns="http://schemas.openxmlformats.org/officeDocument/2006/bibliography" SelectedStyle="\APASixthEditionOfficeOnline.xsl" StyleName="APA" Version="6"/>
-</file>
-
-<file path=customXml/item4.xml><?xml version="1.0" encoding="utf-8"?>
 <p:properties xmlns:p="http://schemas.microsoft.com/office/2006/metadata/properties" xmlns:xsi="http://www.w3.org/2001/XMLSchema-instance" xmlns:pc="http://schemas.microsoft.com/office/infopath/2007/PartnerControls">
   <documentManagement>
     <PublishingExpirationDate xmlns="http://schemas.microsoft.com/sharepoint/v3" xsi:nil="true"/>
@@ -2565,7 +2617,19 @@
 </p:properties>
 </file>
 
+<file path=customXml/item4.xml><?xml version="1.0" encoding="utf-8"?>
+<b:Sources xmlns:b="http://schemas.openxmlformats.org/officeDocument/2006/bibliography" xmlns="http://schemas.openxmlformats.org/officeDocument/2006/bibliography" SelectedStyle="\APASixthEditionOfficeOnline.xsl" StyleName="APA" Version="6"/>
+</file>
+
 <file path=customXml/itemProps1.xml><?xml version="1.0" encoding="utf-8"?>
+<ds:datastoreItem xmlns:ds="http://schemas.openxmlformats.org/officeDocument/2006/customXml" ds:itemID="{8050EDE7-4A57-4D0A-A6F2-D129005F3F09}">
+  <ds:schemaRefs>
+    <ds:schemaRef ds:uri="http://schemas.microsoft.com/sharepoint/v3/contenttype/forms"/>
+  </ds:schemaRefs>
+</ds:datastoreItem>
+</file>
+
+<file path=customXml/itemProps2.xml><?xml version="1.0" encoding="utf-8"?>
 <ds:datastoreItem xmlns:ds="http://schemas.openxmlformats.org/officeDocument/2006/customXml" ds:itemID="{64856DAF-ABCB-4DF4-BEA0-A5E9751155EE}">
   <ds:schemaRefs>
     <ds:schemaRef ds:uri="http://schemas.microsoft.com/office/2006/metadata/contentType"/>
@@ -2584,23 +2648,7 @@
 </ds:datastoreItem>
 </file>
 
-<file path=customXml/itemProps2.xml><?xml version="1.0" encoding="utf-8"?>
-<ds:datastoreItem xmlns:ds="http://schemas.openxmlformats.org/officeDocument/2006/customXml" ds:itemID="{8050EDE7-4A57-4D0A-A6F2-D129005F3F09}">
-  <ds:schemaRefs>
-    <ds:schemaRef ds:uri="http://schemas.microsoft.com/sharepoint/v3/contenttype/forms"/>
-  </ds:schemaRefs>
-</ds:datastoreItem>
-</file>
-
 <file path=customXml/itemProps3.xml><?xml version="1.0" encoding="utf-8"?>
-<ds:datastoreItem xmlns:ds="http://schemas.openxmlformats.org/officeDocument/2006/customXml" ds:itemID="{D0435CBF-65B2-44A7-A2A4-1C4144214899}">
-  <ds:schemaRefs>
-    <ds:schemaRef ds:uri="http://schemas.openxmlformats.org/officeDocument/2006/bibliography"/>
-  </ds:schemaRefs>
-</ds:datastoreItem>
-</file>
-
-<file path=customXml/itemProps4.xml><?xml version="1.0" encoding="utf-8"?>
 <ds:datastoreItem xmlns:ds="http://schemas.openxmlformats.org/officeDocument/2006/customXml" ds:itemID="{6F59FC0A-980B-4610-A160-ACD224C821B5}">
   <ds:schemaRefs>
     <ds:schemaRef ds:uri="http://schemas.microsoft.com/office/2006/metadata/properties"/>
@@ -2608,4 +2656,12 @@
     <ds:schemaRef ds:uri="http://schemas.microsoft.com/sharepoint/v3"/>
   </ds:schemaRefs>
 </ds:datastoreItem>
+</file>
+
+<file path=customXml/itemProps4.xml><?xml version="1.0" encoding="utf-8"?>
+<ds:datastoreItem xmlns:ds="http://schemas.openxmlformats.org/officeDocument/2006/customXml" ds:itemID="{D0435CBF-65B2-44A7-A2A4-1C4144214899}">
+  <ds:schemaRefs>
+    <ds:schemaRef ds:uri="http://schemas.openxmlformats.org/officeDocument/2006/bibliography"/>
+  </ds:schemaRefs>
+</ds:datastoreItem>
 </file>
</xml_diff>

<commit_message>
style: ajustar tablas, márgenes y estilos del documento Word
</commit_message>
<xml_diff>
--- a/plantillas_word/plantilla_informe.docx
+++ b/plantillas_word/plantilla_informe.docx
@@ -42,26 +42,172 @@
   <w:p>
     <w:pPr>
       <w:pStyle w:val="Piedepgina"/>
-      <w:jc w:val="right"/>
+      <w:jc w:val="center"/>
     </w:pPr>
     <w:r>
       <w:rPr>
         <w:noProof/>
         <w:lang w:eastAsia="es-CO"/>
       </w:rPr>
+      <mc:AlternateContent>
+        <mc:Choice Requires="wpg">
+          <w:drawing>
+            <wp:anchor distT="0" distB="0" distL="114300" distR="114300" simplePos="0" relativeHeight="251699200" behindDoc="1" locked="0" layoutInCell="1" allowOverlap="1" wp14:anchorId="1528A4DF" wp14:editId="3F0119C3">
+              <wp:simplePos x="0" y="0"/>
+              <wp:positionH relativeFrom="margin">
+                <wp:align>center</wp:align>
+              </wp:positionH>
+              <wp:positionV relativeFrom="page">
+                <wp:align>bottom</wp:align>
+              </wp:positionV>
+              <wp:extent cx="7172325" cy="797560"/>
+              <wp:effectExtent l="0" t="0" r="0" b="0"/>
+              <wp:wrapTopAndBottom/>
+              <wp:docPr id="1522656076" name="Group 48"/>
+              <wp:cNvGraphicFramePr/>
+              <a:graphic xmlns:a="http://schemas.openxmlformats.org/drawingml/2006/main">
+                <a:graphicData uri="http://schemas.microsoft.com/office/word/2010/wordprocessingGroup">
+                  <wpg:wgp>
+                    <wpg:cNvGrpSpPr/>
+                    <wpg:grpSpPr>
+                      <a:xfrm>
+                        <a:off x="0" y="0"/>
+                        <a:ext cx="7172325" cy="797560"/>
+                        <a:chOff x="357352" y="861848"/>
+                        <a:chExt cx="6820732" cy="979170"/>
+                      </a:xfrm>
+                    </wpg:grpSpPr>
+                    <pic:pic xmlns:pic="http://schemas.openxmlformats.org/drawingml/2006/picture">
+                      <pic:nvPicPr>
+                        <pic:cNvPr id="1021565361" name="2 Imagen" descr="net_GROUP_pie.png"/>
+                        <pic:cNvPicPr>
+                          <a:picLocks noChangeAspect="1"/>
+                        </pic:cNvPicPr>
+                      </pic:nvPicPr>
+                      <pic:blipFill rotWithShape="1">
+                        <a:blip r:embed="rId1"/>
+                        <a:srcRect r="27561"/>
+                        <a:stretch/>
+                      </pic:blipFill>
+                      <pic:spPr bwMode="auto">
+                        <a:xfrm>
+                          <a:off x="357352" y="861848"/>
+                          <a:ext cx="5151755" cy="979170"/>
+                        </a:xfrm>
+                        <a:prstGeom prst="rect">
+                          <a:avLst/>
+                        </a:prstGeom>
+                        <a:ln>
+                          <a:noFill/>
+                        </a:ln>
+                        <a:extLst>
+                          <a:ext uri="{53640926-AAD7-44D8-BBD7-CCE9431645EC}">
+                            <a14:shadowObscured xmlns:a14="http://schemas.microsoft.com/office/drawing/2010/main"/>
+                          </a:ext>
+                        </a:extLst>
+                      </pic:spPr>
+                    </pic:pic>
+                    <pic:pic xmlns:pic="http://schemas.openxmlformats.org/drawingml/2006/picture">
+                      <pic:nvPicPr>
+                        <pic:cNvPr id="1840749200" name="Picture 46" descr="C:\Users\karagon\Pictures\Sin título-1.png"/>
+                        <pic:cNvPicPr>
+                          <a:picLocks noChangeAspect="1"/>
+                        </pic:cNvPicPr>
+                      </pic:nvPicPr>
+                      <pic:blipFill rotWithShape="1">
+                        <a:blip r:embed="rId2">
+                          <a:extLst>
+                            <a:ext uri="{28A0092B-C50C-407E-A947-70E740481C1C}">
+                              <a14:useLocalDpi xmlns:a14="http://schemas.microsoft.com/office/drawing/2010/main" val="0"/>
+                            </a:ext>
+                          </a:extLst>
+                        </a:blip>
+                        <a:srcRect t="16674"/>
+                        <a:stretch/>
+                      </pic:blipFill>
+                      <pic:spPr bwMode="auto">
+                        <a:xfrm>
+                          <a:off x="5602014" y="1030013"/>
+                          <a:ext cx="1576070" cy="787400"/>
+                        </a:xfrm>
+                        <a:prstGeom prst="rect">
+                          <a:avLst/>
+                        </a:prstGeom>
+                        <a:noFill/>
+                        <a:ln>
+                          <a:noFill/>
+                        </a:ln>
+                        <a:extLst>
+                          <a:ext uri="{53640926-AAD7-44D8-BBD7-CCE9431645EC}">
+                            <a14:shadowObscured xmlns:a14="http://schemas.microsoft.com/office/drawing/2010/main"/>
+                          </a:ext>
+                        </a:extLst>
+                      </pic:spPr>
+                    </pic:pic>
+                  </wpg:wgp>
+                </a:graphicData>
+              </a:graphic>
+              <wp14:sizeRelH relativeFrom="margin">
+                <wp14:pctWidth>0</wp14:pctWidth>
+              </wp14:sizeRelH>
+              <wp14:sizeRelV relativeFrom="margin">
+                <wp14:pctHeight>0</wp14:pctHeight>
+              </wp14:sizeRelV>
+            </wp:anchor>
+          </w:drawing>
+        </mc:Choice>
+        <mc:Fallback>
+          <w:pict>
+            <v:group w14:anchorId="5466E621" id="Group 48" o:spid="_x0000_s1026" style="position:absolute;margin-left:0;margin-top:0;width:564.75pt;height:62.8pt;z-index:-251617280;mso-position-horizontal:center;mso-position-horizontal-relative:margin;mso-position-vertical:bottom;mso-position-vertical-relative:page;mso-width-relative:margin;mso-height-relative:margin" coordorigin="3573,8618" coordsize="68207,9791" o:gfxdata="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">
+              <v:shapetype id="_x0000_t75" coordsize="21600,21600" o:spt="75" o:preferrelative="t" path="m@4@5l@4@11@9@11@9@5xe" filled="f" stroked="f">
+                <v:stroke joinstyle="miter"/>
+                <v:formulas>
+                  <v:f eqn="if lineDrawn pixelLineWidth 0"/>
+                  <v:f eqn="sum @0 1 0"/>
+                  <v:f eqn="sum 0 0 @1"/>
+                  <v:f eqn="prod @2 1 2"/>
+                  <v:f eqn="prod @3 21600 pixelWidth"/>
+                  <v:f eqn="prod @3 21600 pixelHeight"/>
+                  <v:f eqn="sum @0 0 1"/>
+                  <v:f eqn="prod @6 1 2"/>
+                  <v:f eqn="prod @7 21600 pixelWidth"/>
+                  <v:f eqn="sum @8 21600 0"/>
+                  <v:f eqn="prod @7 21600 pixelHeight"/>
+                  <v:f eqn="sum @10 21600 0"/>
+                </v:formulas>
+                <v:path o:extrusionok="f" gradientshapeok="t" o:connecttype="rect"/>
+                <o:lock v:ext="edit" aspectratio="t"/>
+              </v:shapetype>
+              <v:shape id="2 Imagen" o:spid="_x0000_s1027" type="#_x0000_t75" alt="net_GROUP_pie.png" style="position:absolute;left:3573;top:8618;width:51518;height:9792;visibility:visible;mso-wrap-style:square" o:gfxdata="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">
+                <v:imagedata r:id="rId3" o:title="net_GROUP_pie" cropright="18062f"/>
+              </v:shape>
+              <v:shape id="Picture 46" o:spid="_x0000_s1028" type="#_x0000_t75" style="position:absolute;left:56020;top:10300;width:15760;height:7874;visibility:visible;mso-wrap-style:square" o:gfxdata="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">
+                <v:imagedata r:id="rId4" o:title="Sin título-1" croptop="10927f"/>
+              </v:shape>
+              <w10:wrap type="topAndBottom" anchorx="margin" anchory="page"/>
+            </v:group>
+          </w:pict>
+        </mc:Fallback>
+      </mc:AlternateContent>
+    </w:r>
+    <w:r>
+      <w:rPr>
+        <w:noProof/>
+        <w:lang w:eastAsia="es-CO"/>
+      </w:rPr>
       <w:drawing>
-        <wp:anchor distT="0" distB="0" distL="114300" distR="114300" simplePos="0" relativeHeight="251669504" behindDoc="0" locked="0" layoutInCell="1" allowOverlap="1" wp14:anchorId="37E6FDFB" wp14:editId="2B9D33AA">
+        <wp:anchor distT="0" distB="0" distL="114300" distR="114300" simplePos="0" relativeHeight="251697152" behindDoc="1" locked="0" layoutInCell="1" allowOverlap="1" wp14:anchorId="175FD85A" wp14:editId="1DA9EC41">
           <wp:simplePos x="0" y="0"/>
           <wp:positionH relativeFrom="page">
             <wp:align>left</wp:align>
           </wp:positionH>
-          <wp:positionV relativeFrom="paragraph">
-            <wp:posOffset>-289560</wp:posOffset>
+          <wp:positionV relativeFrom="page">
+            <wp:posOffset>9153526</wp:posOffset>
           </wp:positionV>
-          <wp:extent cx="5410200" cy="902970"/>
-          <wp:effectExtent l="0" t="0" r="0" b="0"/>
+          <wp:extent cx="7785735" cy="908050"/>
+          <wp:effectExtent l="0" t="0" r="5715" b="6350"/>
           <wp:wrapNone/>
-          <wp:docPr id="4118" name="2 Imagen" descr="net_GROUP_pie.png"/>
+          <wp:docPr id="1364026242" name="Picture 2" descr="C:\Users\karagon\Pictures\rojo.png"/>
           <wp:cNvGraphicFramePr>
             <a:graphicFrameLocks xmlns:a="http://schemas.openxmlformats.org/drawingml/2006/main" noChangeAspect="1"/>
           </wp:cNvGraphicFramePr>
@@ -69,22 +215,40 @@
             <a:graphicData uri="http://schemas.openxmlformats.org/drawingml/2006/picture">
               <pic:pic xmlns:pic="http://schemas.openxmlformats.org/drawingml/2006/picture">
                 <pic:nvPicPr>
-                  <pic:cNvPr id="0" name="net_GROUP_pie.png"/>
-                  <pic:cNvPicPr/>
+                  <pic:cNvPr id="0" name="Picture 1" descr="C:\Users\karagon\Pictures\rojo.png"/>
+                  <pic:cNvPicPr>
+                    <a:picLocks noChangeAspect="1" noChangeArrowheads="1"/>
+                  </pic:cNvPicPr>
                 </pic:nvPicPr>
                 <pic:blipFill rotWithShape="1">
-                  <a:blip r:embed="rId1"/>
-                  <a:srcRect r="27561"/>
+                  <a:blip r:embed="rId5">
+                    <a:extLst>
+                      <a:ext uri="{BEBA8EAE-BF5A-486C-A8C5-ECC9F3942E4B}">
+                        <a14:imgProps xmlns:a14="http://schemas.microsoft.com/office/drawing/2010/main">
+                          <a14:imgLayer r:embed="rId6">
+                            <a14:imgEffect>
+                              <a14:saturation sat="66000"/>
+                            </a14:imgEffect>
+                          </a14:imgLayer>
+                        </a14:imgProps>
+                      </a:ext>
+                      <a:ext uri="{28A0092B-C50C-407E-A947-70E740481C1C}">
+                        <a14:useLocalDpi xmlns:a14="http://schemas.microsoft.com/office/drawing/2010/main" val="0"/>
+                      </a:ext>
+                    </a:extLst>
+                  </a:blip>
+                  <a:srcRect t="9727" b="58663"/>
                   <a:stretch/>
                 </pic:blipFill>
                 <pic:spPr bwMode="auto">
-                  <a:xfrm>
+                  <a:xfrm flipH="1">
                     <a:off x="0" y="0"/>
-                    <a:ext cx="5410200" cy="902970"/>
+                    <a:ext cx="7785735" cy="908050"/>
                   </a:xfrm>
                   <a:prstGeom prst="rect">
                     <a:avLst/>
                   </a:prstGeom>
+                  <a:noFill/>
                   <a:ln>
                     <a:noFill/>
                   </a:ln>
@@ -93,74 +257,6 @@
                       <a14:shadowObscured xmlns:a14="http://schemas.microsoft.com/office/drawing/2010/main"/>
                     </a:ext>
                   </a:extLst>
-                </pic:spPr>
-              </pic:pic>
-            </a:graphicData>
-          </a:graphic>
-          <wp14:sizeRelH relativeFrom="margin">
-            <wp14:pctWidth>0</wp14:pctWidth>
-          </wp14:sizeRelH>
-          <wp14:sizeRelV relativeFrom="margin">
-            <wp14:pctHeight>0</wp14:pctHeight>
-          </wp14:sizeRelV>
-        </wp:anchor>
-      </w:drawing>
-    </w:r>
-    <w:r>
-      <w:rPr>
-        <w:noProof/>
-        <w:lang w:eastAsia="es-CO"/>
-      </w:rPr>
-      <w:drawing>
-        <wp:anchor distT="0" distB="0" distL="114300" distR="114300" simplePos="0" relativeHeight="251672576" behindDoc="0" locked="0" layoutInCell="1" allowOverlap="1" wp14:anchorId="4865D704" wp14:editId="2F91AAAD">
-          <wp:simplePos x="0" y="0"/>
-          <wp:positionH relativeFrom="margin">
-            <wp:posOffset>4958715</wp:posOffset>
-          </wp:positionH>
-          <wp:positionV relativeFrom="margin">
-            <wp:posOffset>8434070</wp:posOffset>
-          </wp:positionV>
-          <wp:extent cx="1457325" cy="623570"/>
-          <wp:effectExtent l="0" t="0" r="9525" b="5080"/>
-          <wp:wrapNone/>
-          <wp:docPr id="12" name="Picture 12" descr="C:\Users\karagon\Pictures\ee.png"/>
-          <wp:cNvGraphicFramePr>
-            <a:graphicFrameLocks xmlns:a="http://schemas.openxmlformats.org/drawingml/2006/main" noChangeAspect="1"/>
-          </wp:cNvGraphicFramePr>
-          <a:graphic xmlns:a="http://schemas.openxmlformats.org/drawingml/2006/main">
-            <a:graphicData uri="http://schemas.openxmlformats.org/drawingml/2006/picture">
-              <pic:pic xmlns:pic="http://schemas.openxmlformats.org/drawingml/2006/picture">
-                <pic:nvPicPr>
-                  <pic:cNvPr id="0" name="Picture 7" descr="C:\Users\karagon\Pictures\ee.png"/>
-                  <pic:cNvPicPr>
-                    <a:picLocks noChangeAspect="1" noChangeArrowheads="1"/>
-                  </pic:cNvPicPr>
-                </pic:nvPicPr>
-                <pic:blipFill>
-                  <a:blip r:embed="rId2" cstate="print">
-                    <a:extLst>
-                      <a:ext uri="{28A0092B-C50C-407E-A947-70E740481C1C}">
-                        <a14:useLocalDpi xmlns:a14="http://schemas.microsoft.com/office/drawing/2010/main" val="0"/>
-                      </a:ext>
-                    </a:extLst>
-                  </a:blip>
-                  <a:srcRect/>
-                  <a:stretch>
-                    <a:fillRect/>
-                  </a:stretch>
-                </pic:blipFill>
-                <pic:spPr bwMode="auto">
-                  <a:xfrm>
-                    <a:off x="0" y="0"/>
-                    <a:ext cx="1457325" cy="623570"/>
-                  </a:xfrm>
-                  <a:prstGeom prst="rect">
-                    <a:avLst/>
-                  </a:prstGeom>
-                  <a:noFill/>
-                  <a:ln>
-                    <a:noFill/>
-                  </a:ln>
                 </pic:spPr>
               </pic:pic>
             </a:graphicData>
@@ -197,15 +293,15 @@
       <mc:AlternateContent>
         <mc:Choice Requires="wpg">
           <w:drawing>
-            <wp:anchor distT="0" distB="0" distL="114300" distR="114300" simplePos="0" relativeHeight="251680768" behindDoc="1" locked="0" layoutInCell="1" allowOverlap="1" wp14:anchorId="110830BF" wp14:editId="32AAB1A0">
+            <wp:anchor distT="0" distB="0" distL="114300" distR="114300" simplePos="0" relativeHeight="251679744" behindDoc="1" locked="0" layoutInCell="1" allowOverlap="1" wp14:anchorId="110830BF" wp14:editId="36939EC0">
               <wp:simplePos x="0" y="0"/>
               <wp:positionH relativeFrom="margin">
-                <wp:posOffset>-852170</wp:posOffset>
+                <wp:posOffset>-762000</wp:posOffset>
               </wp:positionH>
               <wp:positionV relativeFrom="page">
-                <wp:posOffset>9277350</wp:posOffset>
+                <wp:align>bottom</wp:align>
               </wp:positionV>
-              <wp:extent cx="7172325" cy="749935"/>
+              <wp:extent cx="7172325" cy="797560"/>
               <wp:effectExtent l="0" t="0" r="0" b="0"/>
               <wp:wrapTopAndBottom/>
               <wp:docPr id="48" name="Group 48"/>
@@ -217,7 +313,7 @@
                     <wpg:grpSpPr>
                       <a:xfrm>
                         <a:off x="0" y="0"/>
-                        <a:ext cx="7172325" cy="749935"/>
+                        <a:ext cx="7172325" cy="797560"/>
                         <a:chOff x="357352" y="861848"/>
                         <a:chExt cx="6820732" cy="979170"/>
                       </a:xfrm>
@@ -303,7 +399,7 @@
         </mc:Choice>
         <mc:Fallback>
           <w:pict>
-            <v:group w14:anchorId="2D43FDB4" id="Group 48" o:spid="_x0000_s1026" style="position:absolute;margin-left:-67.1pt;margin-top:730.5pt;width:564.75pt;height:59.05pt;z-index:-251635712;mso-position-horizontal-relative:margin;mso-position-vertical-relative:page;mso-width-relative:margin;mso-height-relative:margin" coordorigin="3573,8618" coordsize="68207,9791" o:gfxdata="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">
+            <v:group w14:anchorId="4772BEDE" id="Group 48" o:spid="_x0000_s1026" style="position:absolute;margin-left:-60pt;margin-top:0;width:564.75pt;height:62.8pt;z-index:-251636736;mso-position-horizontal-relative:margin;mso-position-vertical:bottom;mso-position-vertical-relative:page;mso-width-relative:margin;mso-height-relative:margin" coordorigin="3573,8618" coordsize="68207,9791" o:gfxdata="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">
               <v:shapetype id="_x0000_t75" coordsize="21600,21600" o:spt="75" o:preferrelative="t" path="m@4@5l@4@11@9@11@9@5xe" filled="f" stroked="f">
                 <v:stroke joinstyle="miter"/>
                 <v:formulas>
@@ -341,7 +437,7 @@
         <w:lang w:eastAsia="es-CO"/>
       </w:rPr>
       <w:drawing>
-        <wp:anchor distT="0" distB="0" distL="114300" distR="114300" simplePos="0" relativeHeight="251688960" behindDoc="1" locked="0" layoutInCell="1" allowOverlap="1" wp14:anchorId="44203147" wp14:editId="1999C13C">
+        <wp:anchor distT="0" distB="0" distL="114300" distR="114300" simplePos="0" relativeHeight="251687936" behindDoc="1" locked="0" layoutInCell="1" allowOverlap="1" wp14:anchorId="44203147" wp14:editId="583E03A4">
           <wp:simplePos x="0" y="0"/>
           <wp:positionH relativeFrom="page">
             <wp:align>left</wp:align>
@@ -455,7 +551,7 @@
         <w:lang w:eastAsia="es-CO"/>
       </w:rPr>
       <w:drawing>
-        <wp:anchor distT="0" distB="0" distL="114300" distR="114300" simplePos="0" relativeHeight="251693056" behindDoc="1" locked="0" layoutInCell="1" allowOverlap="1" wp14:anchorId="680FB6C9" wp14:editId="28B14F23">
+        <wp:anchor distT="0" distB="0" distL="114300" distR="114300" simplePos="0" relativeHeight="251692032" behindDoc="1" locked="0" layoutInCell="1" allowOverlap="1" wp14:anchorId="680FB6C9" wp14:editId="5E1E86E3">
           <wp:simplePos x="0" y="0"/>
           <wp:positionH relativeFrom="page">
             <wp:posOffset>12065</wp:posOffset>
@@ -534,7 +630,7 @@
         <w:noProof/>
       </w:rPr>
       <w:drawing>
-        <wp:anchor distT="0" distB="0" distL="114300" distR="114300" simplePos="0" relativeHeight="251694080" behindDoc="0" locked="0" layoutInCell="1" allowOverlap="1" wp14:anchorId="65E2385F" wp14:editId="096BD2D0">
+        <wp:anchor distT="0" distB="0" distL="114300" distR="114300" simplePos="0" relativeHeight="251693056" behindDoc="0" locked="0" layoutInCell="1" allowOverlap="1" wp14:anchorId="65E2385F" wp14:editId="5429AA46">
           <wp:simplePos x="0" y="0"/>
           <wp:positionH relativeFrom="leftMargin">
             <wp:align>right</wp:align>
@@ -623,7 +719,7 @@
         <w:noProof/>
       </w:rPr>
       <w:drawing>
-        <wp:anchor distT="0" distB="0" distL="114300" distR="114300" simplePos="0" relativeHeight="251696128" behindDoc="0" locked="0" layoutInCell="1" allowOverlap="1" wp14:anchorId="7D1883F6" wp14:editId="1E32D7E5">
+        <wp:anchor distT="0" distB="0" distL="114300" distR="114300" simplePos="0" relativeHeight="251695104" behindDoc="0" locked="0" layoutInCell="1" allowOverlap="1" wp14:anchorId="7D1883F6" wp14:editId="1940C062">
           <wp:simplePos x="0" y="0"/>
           <wp:positionH relativeFrom="leftMargin">
             <wp:posOffset>123825</wp:posOffset>
@@ -690,7 +786,7 @@
         <w:noProof/>
       </w:rPr>
       <w:drawing>
-        <wp:anchor distT="0" distB="0" distL="114300" distR="114300" simplePos="0" relativeHeight="251695104" behindDoc="0" locked="0" layoutInCell="1" allowOverlap="1" wp14:anchorId="16EAB445" wp14:editId="2EA30B3B">
+        <wp:anchor distT="0" distB="0" distL="114300" distR="114300" simplePos="0" relativeHeight="251694080" behindDoc="0" locked="0" layoutInCell="1" allowOverlap="1" wp14:anchorId="16EAB445" wp14:editId="5D762A47">
           <wp:simplePos x="0" y="0"/>
           <wp:positionH relativeFrom="page">
             <wp:align>right</wp:align>
@@ -2443,15 +2539,6 @@
 </file>
 
 <file path=customXml/item1.xml><?xml version="1.0" encoding="utf-8"?>
-<?mso-contentType ?>
-<FormTemplates xmlns="http://schemas.microsoft.com/sharepoint/v3/contenttype/forms">
-  <Display>DocumentLibraryForm</Display>
-  <Edit>DocumentLibraryForm</Edit>
-  <New>DocumentLibraryForm</New>
-</FormTemplates>
-</file>
-
-<file path=customXml/item2.xml><?xml version="1.0" encoding="utf-8"?>
 <ct:contentTypeSchema xmlns:ct="http://schemas.microsoft.com/office/2006/metadata/contentType" xmlns:ma="http://schemas.microsoft.com/office/2006/metadata/properties/metaAttributes" ct:_="" ma:_="" ma:contentTypeName="Documento" ma:contentTypeID="0x01010018CB7E971FEE164C98FC560B88D6952C" ma:contentTypeVersion="2" ma:contentTypeDescription="Crear nuevo documento." ma:contentTypeScope="" ma:versionID="5d7d805f7feebc4e184084056b635bdd">
   <xsd:schema xmlns:xsd="http://www.w3.org/2001/XMLSchema" xmlns:xs="http://www.w3.org/2001/XMLSchema" xmlns:p="http://schemas.microsoft.com/office/2006/metadata/properties" xmlns:ns1="http://schemas.microsoft.com/sharepoint/v3" xmlns:ns2="c0a28601-0bac-47cc-9244-cdb4dbac3706" targetNamespace="http://schemas.microsoft.com/office/2006/metadata/properties" ma:root="true" ma:fieldsID="362c2595ded0cd39539dba7b51497e9a" ns1:_="" ns2:_="">
     <xsd:import namespace="http://schemas.microsoft.com/sharepoint/v3"/>
@@ -2608,7 +2695,20 @@
 </ct:contentTypeSchema>
 </file>
 
+<file path=customXml/item2.xml><?xml version="1.0" encoding="utf-8"?>
+<?mso-contentType ?>
+<FormTemplates xmlns="http://schemas.microsoft.com/sharepoint/v3/contenttype/forms">
+  <Display>DocumentLibraryForm</Display>
+  <Edit>DocumentLibraryForm</Edit>
+  <New>DocumentLibraryForm</New>
+</FormTemplates>
+</file>
+
 <file path=customXml/item3.xml><?xml version="1.0" encoding="utf-8"?>
+<b:Sources xmlns:b="http://schemas.openxmlformats.org/officeDocument/2006/bibliography" xmlns="http://schemas.openxmlformats.org/officeDocument/2006/bibliography" SelectedStyle="\APASixthEditionOfficeOnline.xsl" StyleName="APA" Version="6"/>
+</file>
+
+<file path=customXml/item4.xml><?xml version="1.0" encoding="utf-8"?>
 <p:properties xmlns:p="http://schemas.microsoft.com/office/2006/metadata/properties" xmlns:xsi="http://www.w3.org/2001/XMLSchema-instance" xmlns:pc="http://schemas.microsoft.com/office/infopath/2007/PartnerControls">
   <documentManagement>
     <PublishingExpirationDate xmlns="http://schemas.microsoft.com/sharepoint/v3" xsi:nil="true"/>
@@ -2617,19 +2717,7 @@
 </p:properties>
 </file>
 
-<file path=customXml/item4.xml><?xml version="1.0" encoding="utf-8"?>
-<b:Sources xmlns:b="http://schemas.openxmlformats.org/officeDocument/2006/bibliography" xmlns="http://schemas.openxmlformats.org/officeDocument/2006/bibliography" SelectedStyle="\APASixthEditionOfficeOnline.xsl" StyleName="APA" Version="6"/>
-</file>
-
 <file path=customXml/itemProps1.xml><?xml version="1.0" encoding="utf-8"?>
-<ds:datastoreItem xmlns:ds="http://schemas.openxmlformats.org/officeDocument/2006/customXml" ds:itemID="{8050EDE7-4A57-4D0A-A6F2-D129005F3F09}">
-  <ds:schemaRefs>
-    <ds:schemaRef ds:uri="http://schemas.microsoft.com/sharepoint/v3/contenttype/forms"/>
-  </ds:schemaRefs>
-</ds:datastoreItem>
-</file>
-
-<file path=customXml/itemProps2.xml><?xml version="1.0" encoding="utf-8"?>
 <ds:datastoreItem xmlns:ds="http://schemas.openxmlformats.org/officeDocument/2006/customXml" ds:itemID="{64856DAF-ABCB-4DF4-BEA0-A5E9751155EE}">
   <ds:schemaRefs>
     <ds:schemaRef ds:uri="http://schemas.microsoft.com/office/2006/metadata/contentType"/>
@@ -2648,7 +2736,23 @@
 </ds:datastoreItem>
 </file>
 
+<file path=customXml/itemProps2.xml><?xml version="1.0" encoding="utf-8"?>
+<ds:datastoreItem xmlns:ds="http://schemas.openxmlformats.org/officeDocument/2006/customXml" ds:itemID="{8050EDE7-4A57-4D0A-A6F2-D129005F3F09}">
+  <ds:schemaRefs>
+    <ds:schemaRef ds:uri="http://schemas.microsoft.com/sharepoint/v3/contenttype/forms"/>
+  </ds:schemaRefs>
+</ds:datastoreItem>
+</file>
+
 <file path=customXml/itemProps3.xml><?xml version="1.0" encoding="utf-8"?>
+<ds:datastoreItem xmlns:ds="http://schemas.openxmlformats.org/officeDocument/2006/customXml" ds:itemID="{D0435CBF-65B2-44A7-A2A4-1C4144214899}">
+  <ds:schemaRefs>
+    <ds:schemaRef ds:uri="http://schemas.openxmlformats.org/officeDocument/2006/bibliography"/>
+  </ds:schemaRefs>
+</ds:datastoreItem>
+</file>
+
+<file path=customXml/itemProps4.xml><?xml version="1.0" encoding="utf-8"?>
 <ds:datastoreItem xmlns:ds="http://schemas.openxmlformats.org/officeDocument/2006/customXml" ds:itemID="{6F59FC0A-980B-4610-A160-ACD224C821B5}">
   <ds:schemaRefs>
     <ds:schemaRef ds:uri="http://schemas.microsoft.com/office/2006/metadata/properties"/>
@@ -2656,12 +2760,4 @@
     <ds:schemaRef ds:uri="http://schemas.microsoft.com/sharepoint/v3"/>
   </ds:schemaRefs>
 </ds:datastoreItem>
-</file>
-
-<file path=customXml/itemProps4.xml><?xml version="1.0" encoding="utf-8"?>
-<ds:datastoreItem xmlns:ds="http://schemas.openxmlformats.org/officeDocument/2006/customXml" ds:itemID="{D0435CBF-65B2-44A7-A2A4-1C4144214899}">
-  <ds:schemaRefs>
-    <ds:schemaRef ds:uri="http://schemas.openxmlformats.org/officeDocument/2006/bibliography"/>
-  </ds:schemaRefs>
-</ds:datastoreItem>
 </file>
</xml_diff>